<commit_message>
Add Excel generation functionality for SQL conversion results
- Introduced a new script to generate Excel files containing conversion results from SQL statements.
- Implemented logic to extract relevant data from XML and format it for Excel output.
- Added support for handling various SQL operations (select, update, delete) and their corresponding parameters.
- Included test cases to validate the conversion process and ensure accurate output.
</commit_message>
<xml_diff>
--- a/iBatis转JDBC转换方案报告.docx
+++ b/iBatis转JDBC转换方案报告.docx
@@ -47,7 +47,7 @@
         <w:rPr>
           <w:sz w:val="22"/>
         </w:rPr>
-        <w:t>版本：v1.1</w:t>
+        <w:t>版本：v1.2</w:t>
       </w:r>
     </w:p>
     <w:p>
@@ -112,6 +112,11 @@
     <w:p>
       <w:r>
         <w:t>10. 总结</w:t>
+      </w:r>
+    </w:p>
+    <w:p>
+      <w:r>
+        <w:t>11. 落地计划（里程碑）</w:t>
       </w:r>
     </w:p>
     <w:p>
@@ -441,6 +446,326 @@
     </w:tbl>
     <w:p>
       <w:pPr>
+        <w:pStyle w:val="Heading2"/>
+      </w:pPr>
+      <w:r>
+        <w:t>2.3 iBatis2 参数类型兼容策略（上线防错）</w:t>
+      </w:r>
+    </w:p>
+    <w:p>
+      <w:r>
+        <w:t>为避免迁移后线上参数类型错配导致数据库层异常，系统在转换入口增加 parameterClass 校验与规范化，策略以“与 iBatis2 行为对齐 + 应用层 fail-fast”为原则。</w:t>
+      </w:r>
+    </w:p>
+    <w:tbl>
+      <w:tblPr>
+        <w:tblStyle w:val="LightGrid-Accent1"/>
+        <w:tblW w:type="auto" w:w="0"/>
+        <w:tblLook w:firstColumn="1" w:firstRow="1" w:lastColumn="0" w:lastRow="0" w:noHBand="0" w:noVBand="1" w:val="04A0"/>
+      </w:tblPr>
+      <w:tblGrid>
+        <w:gridCol w:w="2160"/>
+        <w:gridCol w:w="2160"/>
+        <w:gridCol w:w="2160"/>
+        <w:gridCol w:w="2160"/>
+      </w:tblGrid>
+      <w:tr>
+        <w:tc>
+          <w:tcPr>
+            <w:tcW w:type="dxa" w:w="2160"/>
+          </w:tcPr>
+          <w:p>
+            <w:r>
+              <w:t>声明类型（parameterClass）</w:t>
+            </w:r>
+          </w:p>
+        </w:tc>
+        <w:tc>
+          <w:tcPr>
+            <w:tcW w:type="dxa" w:w="2160"/>
+          </w:tcPr>
+          <w:p>
+            <w:r>
+              <w:t>输入示例</w:t>
+            </w:r>
+          </w:p>
+        </w:tc>
+        <w:tc>
+          <w:tcPr>
+            <w:tcW w:type="dxa" w:w="2160"/>
+          </w:tcPr>
+          <w:p>
+            <w:r>
+              <w:t>处理结果</w:t>
+            </w:r>
+          </w:p>
+        </w:tc>
+        <w:tc>
+          <w:tcPr>
+            <w:tcW w:type="dxa" w:w="2160"/>
+          </w:tcPr>
+          <w:p>
+            <w:r>
+              <w:t>兼容性结论</w:t>
+            </w:r>
+          </w:p>
+        </w:tc>
+      </w:tr>
+      <w:tr>
+        <w:tc>
+          <w:tcPr>
+            <w:tcW w:type="dxa" w:w="2160"/>
+          </w:tcPr>
+          <w:p>
+            <w:r>
+              <w:t>long</w:t>
+            </w:r>
+          </w:p>
+        </w:tc>
+        <w:tc>
+          <w:tcPr>
+            <w:tcW w:type="dxa" w:w="2160"/>
+          </w:tcPr>
+          <w:p>
+            <w:r>
+              <w:t>"123"</w:t>
+            </w:r>
+          </w:p>
+        </w:tc>
+        <w:tc>
+          <w:tcPr>
+            <w:tcW w:type="dxa" w:w="2160"/>
+          </w:tcPr>
+          <w:p>
+            <w:r>
+              <w:t>转为 123L</w:t>
+            </w:r>
+          </w:p>
+        </w:tc>
+        <w:tc>
+          <w:tcPr>
+            <w:tcW w:type="dxa" w:w="2160"/>
+          </w:tcPr>
+          <w:p>
+            <w:r>
+              <w:t>与 iBatis2 常见行为一致（数值字符串可解析）</w:t>
+            </w:r>
+          </w:p>
+        </w:tc>
+      </w:tr>
+      <w:tr>
+        <w:tc>
+          <w:tcPr>
+            <w:tcW w:type="dxa" w:w="2160"/>
+          </w:tcPr>
+          <w:p>
+            <w:r>
+              <w:t>long</w:t>
+            </w:r>
+          </w:p>
+        </w:tc>
+        <w:tc>
+          <w:tcPr>
+            <w:tcW w:type="dxa" w:w="2160"/>
+          </w:tcPr>
+          <w:p>
+            <w:r>
+              <w:t>123 (Integer)</w:t>
+            </w:r>
+          </w:p>
+        </w:tc>
+        <w:tc>
+          <w:tcPr>
+            <w:tcW w:type="dxa" w:w="2160"/>
+          </w:tcPr>
+          <w:p>
+            <w:r>
+              <w:t>转为 123L</w:t>
+            </w:r>
+          </w:p>
+        </w:tc>
+        <w:tc>
+          <w:tcPr>
+            <w:tcW w:type="dxa" w:w="2160"/>
+          </w:tcPr>
+          <w:p>
+            <w:r>
+              <w:t>与 iBatis2 常见行为一致（数值类型可归一）</w:t>
+            </w:r>
+          </w:p>
+        </w:tc>
+      </w:tr>
+      <w:tr>
+        <w:tc>
+          <w:tcPr>
+            <w:tcW w:type="dxa" w:w="2160"/>
+          </w:tcPr>
+          <w:p>
+            <w:r>
+              <w:t>long</w:t>
+            </w:r>
+          </w:p>
+        </w:tc>
+        <w:tc>
+          <w:tcPr>
+            <w:tcW w:type="dxa" w:w="2160"/>
+          </w:tcPr>
+          <w:p>
+            <w:r>
+              <w:t>""</w:t>
+            </w:r>
+          </w:p>
+        </w:tc>
+        <w:tc>
+          <w:tcPr>
+            <w:tcW w:type="dxa" w:w="2160"/>
+          </w:tcPr>
+          <w:p>
+            <w:r>
+              <w:t>抛异常（empty string cannot be converted to number）</w:t>
+            </w:r>
+          </w:p>
+        </w:tc>
+        <w:tc>
+          <w:tcPr>
+            <w:tcW w:type="dxa" w:w="2160"/>
+          </w:tcPr>
+          <w:p>
+            <w:r>
+              <w:t>与 iBatis2 严格类型语义一致</w:t>
+            </w:r>
+          </w:p>
+        </w:tc>
+      </w:tr>
+      <w:tr>
+        <w:tc>
+          <w:tcPr>
+            <w:tcW w:type="dxa" w:w="2160"/>
+          </w:tcPr>
+          <w:p>
+            <w:r>
+              <w:t>long</w:t>
+            </w:r>
+          </w:p>
+        </w:tc>
+        <w:tc>
+          <w:tcPr>
+            <w:tcW w:type="dxa" w:w="2160"/>
+          </w:tcPr>
+          <w:p>
+            <w:r>
+              <w:t>true</w:t>
+            </w:r>
+          </w:p>
+        </w:tc>
+        <w:tc>
+          <w:tcPr>
+            <w:tcW w:type="dxa" w:w="2160"/>
+          </w:tcPr>
+          <w:p>
+            <w:r>
+              <w:t>抛异常（expected numeric value）</w:t>
+            </w:r>
+          </w:p>
+        </w:tc>
+        <w:tc>
+          <w:tcPr>
+            <w:tcW w:type="dxa" w:w="2160"/>
+          </w:tcPr>
+          <w:p>
+            <w:r>
+              <w:t>与 iBatis2 严格类型语义一致</w:t>
+            </w:r>
+          </w:p>
+        </w:tc>
+      </w:tr>
+      <w:tr>
+        <w:tc>
+          <w:tcPr>
+            <w:tcW w:type="dxa" w:w="2160"/>
+          </w:tcPr>
+          <w:p>
+            <w:r>
+              <w:t>long</w:t>
+            </w:r>
+          </w:p>
+        </w:tc>
+        <w:tc>
+          <w:tcPr>
+            <w:tcW w:type="dxa" w:w="2160"/>
+          </w:tcPr>
+          <w:p>
+            <w:r>
+              <w:t>null</w:t>
+            </w:r>
+          </w:p>
+        </w:tc>
+        <w:tc>
+          <w:tcPr>
+            <w:tcW w:type="dxa" w:w="2160"/>
+          </w:tcPr>
+          <w:p>
+            <w:r>
+              <w:t>保留 null（不转 0）</w:t>
+            </w:r>
+          </w:p>
+        </w:tc>
+        <w:tc>
+          <w:tcPr>
+            <w:tcW w:type="dxa" w:w="2160"/>
+          </w:tcPr>
+          <w:p>
+            <w:r>
+              <w:t>与 iBatis2 默认行为一致（未配置 nullValue）</w:t>
+            </w:r>
+          </w:p>
+        </w:tc>
+      </w:tr>
+      <w:tr>
+        <w:tc>
+          <w:tcPr>
+            <w:tcW w:type="dxa" w:w="2160"/>
+          </w:tcPr>
+          <w:p>
+            <w:r>
+              <w:t>map</w:t>
+            </w:r>
+          </w:p>
+        </w:tc>
+        <w:tc>
+          <w:tcPr>
+            <w:tcW w:type="dxa" w:w="2160"/>
+          </w:tcPr>
+          <w:p>
+            <w:r>
+              <w:t>List / String</w:t>
+            </w:r>
+          </w:p>
+        </w:tc>
+        <w:tc>
+          <w:tcPr>
+            <w:tcW w:type="dxa" w:w="2160"/>
+          </w:tcPr>
+          <w:p>
+            <w:r>
+              <w:t>抛异常（expected map-like object）</w:t>
+            </w:r>
+          </w:p>
+        </w:tc>
+        <w:tc>
+          <w:tcPr>
+            <w:tcW w:type="dxa" w:w="2160"/>
+          </w:tcPr>
+          <w:p>
+            <w:r>
+              <w:t>与 iBatis2 参数契约一致</w:t>
+            </w:r>
+          </w:p>
+        </w:tc>
+      </w:tr>
+    </w:tbl>
+    <w:p>
+      <w:pPr>
         <w:pStyle w:val="Heading1"/>
       </w:pPr>
       <w:r>
@@ -1118,7 +1443,7 @@
         <w:pStyle w:val="ListBullet"/>
       </w:pPr>
       <w:r>
-        <w:t>测试规模：以当前代码库实际测试集合为准</w:t>
+        <w:t>关键回归命令：mvn clean -q -Dtest=IbatisToJdbcConverterTest test</w:t>
       </w:r>
     </w:p>
     <w:p>
@@ -1126,7 +1451,55 @@
         <w:pStyle w:val="ListBullet"/>
       </w:pPr>
       <w:r>
-        <w:t>测试结果：以本次执行输出为准</w:t>
+        <w:t>测试规模：IbatisToJdbcConverterTest（当前 19 个用例）</w:t>
+      </w:r>
+    </w:p>
+    <w:p>
+      <w:pPr>
+        <w:pStyle w:val="ListBullet"/>
+      </w:pPr>
+      <w:r>
+        <w:t>测试结果：通过（最近一次执行 TEST_EXIT:0）</w:t>
+      </w:r>
+    </w:p>
+    <w:p>
+      <w:pPr>
+        <w:pStyle w:val="Heading2"/>
+      </w:pPr>
+      <w:r>
+        <w:t>6.4 关键新增验证点（本轮）</w:t>
+      </w:r>
+    </w:p>
+    <w:p>
+      <w:pPr>
+        <w:pStyle w:val="ListBullet"/>
+      </w:pPr>
+      <w:r>
+        <w:t>新增泛型查询能力：queryForObject/queryForList(Class&lt;T&gt;) 与 query(RowMapper&lt;T&gt;)</w:t>
+      </w:r>
+    </w:p>
+    <w:p>
+      <w:pPr>
+        <w:pStyle w:val="ListBullet"/>
+      </w:pPr>
+      <w:r>
+        <w:t>新增 iBatis2 参数类型对齐校验：在 convertPrepared 入口进行 parameterClass 验证</w:t>
+      </w:r>
+    </w:p>
+    <w:p>
+      <w:pPr>
+        <w:pStyle w:val="ListBullet"/>
+      </w:pPr>
+      <w:r>
+        <w:t>参数兼容综合测试：已合并为单一测试方法，覆盖 11 个场景并附注释</w:t>
+      </w:r>
+    </w:p>
+    <w:p>
+      <w:pPr>
+        <w:pStyle w:val="ListBullet"/>
+      </w:pPr>
+      <w:r>
+        <w:t>异常测试整合：statement/include/resultMap 缺失场景已合并并通过</w:t>
       </w:r>
     </w:p>
     <w:p>
@@ -1300,6 +1673,46 @@
       </w:pPr>
       <w:r>
         <w:t>支持更多 iBatis 标签：placeholder、typeAlias 等</w:t>
+      </w:r>
+    </w:p>
+    <w:p>
+      <w:pPr>
+        <w:pStyle w:val="Heading2"/>
+      </w:pPr>
+      <w:r>
+        <w:t>8.3 风险边界与治理建议</w:t>
+      </w:r>
+    </w:p>
+    <w:p>
+      <w:pPr>
+        <w:pStyle w:val="ListBullet"/>
+      </w:pPr>
+      <w:r>
+        <w:t>SQL 注入风险：$param$ 为原样拼接，必须在调用侧对来源与白名单做限制</w:t>
+      </w:r>
+    </w:p>
+    <w:p>
+      <w:pPr>
+        <w:pStyle w:val="ListBullet"/>
+      </w:pPr>
+      <w:r>
+        <w:t>类型契约风险：parameterClass 与实参不一致会 fail-fast，建议迁移期先做全量扫描</w:t>
+      </w:r>
+    </w:p>
+    <w:p>
+      <w:pPr>
+        <w:pStyle w:val="ListBullet"/>
+      </w:pPr>
+      <w:r>
+        <w:t>兼容性风险：个别历史 SQL 可能依赖隐式类型转换，需通过报告逐条核验</w:t>
+      </w:r>
+    </w:p>
+    <w:p>
+      <w:pPr>
+        <w:pStyle w:val="ListBullet"/>
+      </w:pPr>
+      <w:r>
+        <w:t>运维风险：热更新需纳入变更流程（灰度、回滚、审计）</w:t>
       </w:r>
     </w:p>
     <w:p>
@@ -1423,6 +1836,86 @@
     <w:p>
       <w:r>
         <w:t>该方案适用于遗留系统现代化改造场景，可在保持业务连续性的前提下分阶段推进。在现有系统约束与迁移目标下，该方案可视为当前阶段可能的最优解。</w:t>
+      </w:r>
+    </w:p>
+    <w:p>
+      <w:pPr>
+        <w:pStyle w:val="Heading1"/>
+      </w:pPr>
+      <w:r>
+        <w:t>11. 落地计划（里程碑）</w:t>
+      </w:r>
+    </w:p>
+    <w:p>
+      <w:pPr>
+        <w:pStyle w:val="Heading2"/>
+      </w:pPr>
+      <w:r>
+        <w:t>11.1 里程碑划分</w:t>
+      </w:r>
+    </w:p>
+    <w:p>
+      <w:pPr>
+        <w:pStyle w:val="ListBullet"/>
+      </w:pPr>
+      <w:r>
+        <w:t>M1【已完成】：已完成 SQLMap 清单扫描与高风险语句标注（$param$、复杂 dynamic）</w:t>
+      </w:r>
+    </w:p>
+    <w:p>
+      <w:pPr>
+        <w:pStyle w:val="ListBullet"/>
+      </w:pPr>
+      <w:r>
+        <w:t>M2【已完成】：已完成转换器接入与 parameterClass 类型错配治理</w:t>
+      </w:r>
+    </w:p>
+    <w:p>
+      <w:pPr>
+        <w:pStyle w:val="ListBullet"/>
+      </w:pPr>
+      <w:r>
+        <w:t>M3【未开始】：完成项目中 iBatis 调用的全量替换（切换到 JdbcExecutor/SpringJdbcExecutor）并完成联调</w:t>
+      </w:r>
+    </w:p>
+    <w:p>
+      <w:pPr>
+        <w:pStyle w:val="ListBullet"/>
+      </w:pPr>
+      <w:r>
+        <w:t>M4【未开始】：上线后监控与热更新治理，持续优化边角场景（所有 SQL 均为运行时自动转换，后续如有新增 XML 也可自动支持，无需手工静态替换）</w:t>
+      </w:r>
+    </w:p>
+    <w:p>
+      <w:pPr>
+        <w:pStyle w:val="Heading2"/>
+      </w:pPr>
+      <w:r>
+        <w:t>11.2 验收标准</w:t>
+      </w:r>
+    </w:p>
+    <w:p>
+      <w:pPr>
+        <w:pStyle w:val="ListBullet"/>
+      </w:pPr>
+      <w:r>
+        <w:t>功能验收：关键业务 SQL 全量通过转换并可执行（所有 SQL 均在运行时自动转换，无需静态替换）；被融合项目的 iBatis 调用已全量替换为新方法，未替换项为 0</w:t>
+      </w:r>
+    </w:p>
+    <w:p>
+      <w:pPr>
+        <w:pStyle w:val="ListBullet"/>
+      </w:pPr>
+      <w:r>
+        <w:t>质量验收：核心测试通过率 100%，无阻断级回归问题</w:t>
+      </w:r>
+    </w:p>
+    <w:p>
+      <w:pPr>
+        <w:pStyle w:val="ListBullet"/>
+      </w:pPr>
+      <w:r>
+        <w:t>运行验收：系统稳定运行，无严重故障或高优先级问题</w:t>
       </w:r>
     </w:p>
     <w:sectPr>

</xml_diff>